<commit_message>
docs: update project report and presentation with verified ER, Oracle, MongoDB Atlas, and UI screenshots
</commit_message>
<xml_diff>
--- a/docs/FORENSYS_Final_Project_Report.docx
+++ b/docs/FORENSYS_Final_Project_Report.docx
@@ -5484,7 +5484,7 @@
       <w:r>
         <w:drawing>
           <wp:inline xmlns:a="http://schemas.openxmlformats.org/drawingml/2006/main" xmlns:pic="http://schemas.openxmlformats.org/drawingml/2006/picture">
-            <wp:extent cx="5303520" cy="2983230"/>
+            <wp:extent cx="5303520" cy="2558534"/>
             <wp:docPr id="1" name="Picture 1"/>
             <wp:cNvGraphicFramePr>
               <a:graphicFrameLocks noChangeAspect="1"/>
@@ -5493,7 +5493,7 @@
               <a:graphicData uri="http://schemas.openxmlformats.org/drawingml/2006/picture">
                 <pic:pic>
                   <pic:nvPicPr>
-                    <pic:cNvPr id="0" name="media_1792400165706_575a231d.png"/>
+                    <pic:cNvPr id="0" name="atlas_cloud_collections.png"/>
                     <pic:cNvPicPr/>
                   </pic:nvPicPr>
                   <pic:blipFill>
@@ -5505,7 +5505,7 @@
                   <pic:spPr>
                     <a:xfrm>
                       <a:off x="0" y="0"/>
-                      <a:ext cx="5303520" cy="2983230"/>
+                      <a:ext cx="5303520" cy="2558534"/>
                     </a:xfrm>
                     <a:prstGeom prst="rect"/>
                   </pic:spPr>
@@ -5528,7 +5528,7 @@
           <w:color w:val="64748B"/>
           <w:sz w:val="19"/>
         </w:rPr>
-        <w:t>Figure 2.1: Live MongoDB Atlas Production Cloud Cluster Architecture (forensys database)</w:t>
+        <w:t>Figure 2.1: Live MongoDB Atlas Production Cloud Console (Data Explorer) showing Cluster0 and forensys Collections</w:t>
       </w:r>
     </w:p>
     <w:p>
@@ -5809,7 +5809,7 @@
           <w:color w:val="1E3A8A"/>
           <w:sz w:val="26"/>
         </w:rPr>
-        <w:t>3.2 Conceptual Design: Enhanced Entity-Relationship (EER) Modeling</w:t>
+        <w:t>3.2 Conceptual Design: Entity-Relationship (ER) &amp; Enhanced ER (EER) Modeling</w:t>
       </w:r>
     </w:p>
     <w:p>
@@ -5824,7 +5824,62 @@
           <w:color w:val="212529"/>
           <w:sz w:val="22"/>
         </w:rPr>
-        <w:t>The conceptual domain is modeled via an Enhanced Entity-Relationship (EER) diagram. The core entities and their cardinalities are structured as follows:</w:t>
+        <w:t>The conceptual domain is modeled via comprehensive Entity-Relationship (ER) and Enhanced Entity-Relationship (EER) diagrams. Figure 3.1 illustrates the structural entities, attributes, primary keys, foreign keys, and cardinalities. Figure 3.2 details the Enhanced ER specialization (ISA hierarchy) modeling distinct officer personas and custodial interactions:</w:t>
+      </w:r>
+    </w:p>
+    <w:p>
+      <w:pPr>
+        <w:spacing w:before="160" w:after="40"/>
+        <w:jc w:val="center"/>
+      </w:pPr>
+      <w:r>
+        <w:drawing>
+          <wp:inline xmlns:a="http://schemas.openxmlformats.org/drawingml/2006/main" xmlns:pic="http://schemas.openxmlformats.org/drawingml/2006/picture">
+            <wp:extent cx="5303520" cy="3246167"/>
+            <wp:docPr id="2" name="Picture 2"/>
+            <wp:cNvGraphicFramePr>
+              <a:graphicFrameLocks noChangeAspect="1"/>
+            </wp:cNvGraphicFramePr>
+            <a:graphic>
+              <a:graphicData uri="http://schemas.openxmlformats.org/drawingml/2006/picture">
+                <pic:pic>
+                  <pic:nvPicPr>
+                    <pic:cNvPr id="0" name="er_diagram.png"/>
+                    <pic:cNvPicPr/>
+                  </pic:nvPicPr>
+                  <pic:blipFill>
+                    <a:blip r:embed="rId10"/>
+                    <a:stretch>
+                      <a:fillRect/>
+                    </a:stretch>
+                  </pic:blipFill>
+                  <pic:spPr>
+                    <a:xfrm>
+                      <a:off x="0" y="0"/>
+                      <a:ext cx="5303520" cy="3246167"/>
+                    </a:xfrm>
+                    <a:prstGeom prst="rect"/>
+                  </pic:spPr>
+                </pic:pic>
+              </a:graphicData>
+            </a:graphic>
+          </wp:inline>
+        </w:drawing>
+      </w:r>
+    </w:p>
+    <w:p>
+      <w:pPr>
+        <w:spacing w:after="200"/>
+        <w:jc w:val="center"/>
+      </w:pPr>
+      <w:r>
+        <w:rPr>
+          <w:rFonts w:ascii="Calibri" w:hAnsi="Calibri"/>
+          <w:i/>
+          <w:color w:val="64748B"/>
+          <w:sz w:val="19"/>
+        </w:rPr>
+        <w:t>Figure 3.1: Entity-Relationship (ER) Diagram of FORENSYS Database</w:t>
       </w:r>
     </w:p>
     <w:p>
@@ -5839,7 +5894,7 @@
           <w:color w:val="212529"/>
           <w:sz w:val="22"/>
         </w:rPr>
-        <w:t xml:space="preserve">OFFICERS to CASES (LeadOfficer): </w:t>
+        <w:t xml:space="preserve">OFFICERS to CASES (Manages / Leads): </w:t>
       </w:r>
       <w:r>
         <w:rPr>
@@ -5862,7 +5917,7 @@
           <w:color w:val="212529"/>
           <w:sz w:val="22"/>
         </w:rPr>
-        <w:t xml:space="preserve">CASES to EVIDENCE: </w:t>
+        <w:t xml:space="preserve">CASES to EVIDENCE (Contains): </w:t>
       </w:r>
       <w:r>
         <w:rPr>
@@ -5908,7 +5963,7 @@
           <w:color w:val="212529"/>
           <w:sz w:val="22"/>
         </w:rPr>
-        <w:t xml:space="preserve">EVIDENCE to CUSTODY_LOG: </w:t>
+        <w:t xml:space="preserve">EVIDENCE to CUSTODY_LOG (Generates / Tracks): </w:t>
       </w:r>
       <w:r>
         <w:rPr>
@@ -5939,7 +5994,7 @@
           <w:color w:val="212529"/>
           <w:sz w:val="22"/>
         </w:rPr>
-        <w:t>Two distinct Many-to-One relationships (ReleasedBy and ReceivedBy) referencing the OFFICERS table, tracking the handoff pair.</w:t>
+        <w:t>Two distinct Many-to-One relationships (Releases and Receives) referencing the OFFICERS table, tracking the handoff pair.</w:t>
       </w:r>
     </w:p>
     <w:p>
@@ -5963,6 +6018,61 @@
           <w:sz w:val="22"/>
         </w:rPr>
         <w:t>Independent audit trail. Records status changes triggered on the CASES table, intentionally avoiding a foreign key constraint to preserve audit history even if a case is purged.</w:t>
+      </w:r>
+    </w:p>
+    <w:p>
+      <w:pPr>
+        <w:spacing w:before="160" w:after="40"/>
+        <w:jc w:val="center"/>
+      </w:pPr>
+      <w:r>
+        <w:drawing>
+          <wp:inline xmlns:a="http://schemas.openxmlformats.org/drawingml/2006/main" xmlns:pic="http://schemas.openxmlformats.org/drawingml/2006/picture">
+            <wp:extent cx="5303520" cy="3962102"/>
+            <wp:docPr id="3" name="Picture 3"/>
+            <wp:cNvGraphicFramePr>
+              <a:graphicFrameLocks noChangeAspect="1"/>
+            </wp:cNvGraphicFramePr>
+            <a:graphic>
+              <a:graphicData uri="http://schemas.openxmlformats.org/drawingml/2006/picture">
+                <pic:pic>
+                  <pic:nvPicPr>
+                    <pic:cNvPr id="0" name="eer_diagram.png"/>
+                    <pic:cNvPicPr/>
+                  </pic:nvPicPr>
+                  <pic:blipFill>
+                    <a:blip r:embed="rId11"/>
+                    <a:stretch>
+                      <a:fillRect/>
+                    </a:stretch>
+                  </pic:blipFill>
+                  <pic:spPr>
+                    <a:xfrm>
+                      <a:off x="0" y="0"/>
+                      <a:ext cx="5303520" cy="3962102"/>
+                    </a:xfrm>
+                    <a:prstGeom prst="rect"/>
+                  </pic:spPr>
+                </pic:pic>
+              </a:graphicData>
+            </a:graphic>
+          </wp:inline>
+        </w:drawing>
+      </w:r>
+    </w:p>
+    <w:p>
+      <w:pPr>
+        <w:spacing w:after="200"/>
+        <w:jc w:val="center"/>
+      </w:pPr>
+      <w:r>
+        <w:rPr>
+          <w:rFonts w:ascii="Calibri" w:hAnsi="Calibri"/>
+          <w:i/>
+          <w:color w:val="64748B"/>
+          <w:sz w:val="19"/>
+        </w:rPr>
+        <w:t>Figure 3.2: Enhanced Entity-Relationship (EER) Diagram with Role Specialization (ISA Hierarchy)</w:t>
       </w:r>
     </w:p>
     <w:p>
@@ -7378,8 +7488,8 @@
       <w:r>
         <w:drawing>
           <wp:inline xmlns:a="http://schemas.openxmlformats.org/drawingml/2006/main" xmlns:pic="http://schemas.openxmlformats.org/drawingml/2006/picture">
-            <wp:extent cx="5303520" cy="2983230"/>
-            <wp:docPr id="2" name="Picture 2"/>
+            <wp:extent cx="5303520" cy="5427910"/>
+            <wp:docPr id="4" name="Picture 4"/>
             <wp:cNvGraphicFramePr>
               <a:graphicFrameLocks noChangeAspect="1"/>
             </wp:cNvGraphicFramePr>
@@ -7387,11 +7497,11 @@
               <a:graphicData uri="http://schemas.openxmlformats.org/drawingml/2006/picture">
                 <pic:pic>
                   <pic:nvPicPr>
-                    <pic:cNvPr id="0" name="media_1789148621879.png"/>
+                    <pic:cNvPr id="0" name="oracle_tables_verification.png"/>
                     <pic:cNvPicPr/>
                   </pic:nvPicPr>
                   <pic:blipFill>
-                    <a:blip r:embed="rId10"/>
+                    <a:blip r:embed="rId12"/>
                     <a:stretch>
                       <a:fillRect/>
                     </a:stretch>
@@ -7399,7 +7509,7 @@
                   <pic:spPr>
                     <a:xfrm>
                       <a:off x="0" y="0"/>
-                      <a:ext cx="5303520" cy="2983230"/>
+                      <a:ext cx="5303520" cy="5427910"/>
                     </a:xfrm>
                     <a:prstGeom prst="rect"/>
                   </pic:spPr>
@@ -7422,62 +7532,7 @@
           <w:color w:val="64748B"/>
           <w:sz w:val="19"/>
         </w:rPr>
-        <w:t>Figure 3.1: Oracle 11g SQL*Plus Execution — Table Creation &amp; Integrity Constraints</w:t>
-      </w:r>
-    </w:p>
-    <w:p>
-      <w:pPr>
-        <w:spacing w:before="160" w:after="40"/>
-        <w:jc w:val="center"/>
-      </w:pPr>
-      <w:r>
-        <w:drawing>
-          <wp:inline xmlns:a="http://schemas.openxmlformats.org/drawingml/2006/main" xmlns:pic="http://schemas.openxmlformats.org/drawingml/2006/picture">
-            <wp:extent cx="5303520" cy="2983230"/>
-            <wp:docPr id="3" name="Picture 3"/>
-            <wp:cNvGraphicFramePr>
-              <a:graphicFrameLocks noChangeAspect="1"/>
-            </wp:cNvGraphicFramePr>
-            <a:graphic>
-              <a:graphicData uri="http://schemas.openxmlformats.org/drawingml/2006/picture">
-                <pic:pic>
-                  <pic:nvPicPr>
-                    <pic:cNvPr id="0" name="media_1789148631219.png"/>
-                    <pic:cNvPicPr/>
-                  </pic:nvPicPr>
-                  <pic:blipFill>
-                    <a:blip r:embed="rId11"/>
-                    <a:stretch>
-                      <a:fillRect/>
-                    </a:stretch>
-                  </pic:blipFill>
-                  <pic:spPr>
-                    <a:xfrm>
-                      <a:off x="0" y="0"/>
-                      <a:ext cx="5303520" cy="2983230"/>
-                    </a:xfrm>
-                    <a:prstGeom prst="rect"/>
-                  </pic:spPr>
-                </pic:pic>
-              </a:graphicData>
-            </a:graphic>
-          </wp:inline>
-        </w:drawing>
-      </w:r>
-    </w:p>
-    <w:p>
-      <w:pPr>
-        <w:spacing w:after="200"/>
-        <w:jc w:val="center"/>
-      </w:pPr>
-      <w:r>
-        <w:rPr>
-          <w:rFonts w:ascii="Calibri" w:hAnsi="Calibri"/>
-          <w:i/>
-          <w:color w:val="64748B"/>
-          <w:sz w:val="19"/>
-        </w:rPr>
-        <w:t>Figure 3.2: Oracle 11g SQL*Plus Execution — Subtype Tables (PHYSICAL, DIGITAL) &amp; CUSTODY_LOG</w:t>
+        <w:t>Figure 3.3: Oracle 11g SQL*Plus Execution — Schema Table Catalog and Multi-Table Row Verification</w:t>
       </w:r>
     </w:p>
     <w:p>
@@ -7677,8 +7732,8 @@
       <w:r>
         <w:drawing>
           <wp:inline xmlns:a="http://schemas.openxmlformats.org/drawingml/2006/main" xmlns:pic="http://schemas.openxmlformats.org/drawingml/2006/picture">
-            <wp:extent cx="5303520" cy="2983230"/>
-            <wp:docPr id="4" name="Picture 4"/>
+            <wp:extent cx="5303520" cy="4622282"/>
+            <wp:docPr id="5" name="Picture 5"/>
             <wp:cNvGraphicFramePr>
               <a:graphicFrameLocks noChangeAspect="1"/>
             </wp:cNvGraphicFramePr>
@@ -7686,11 +7741,11 @@
               <a:graphicData uri="http://schemas.openxmlformats.org/drawingml/2006/picture">
                 <pic:pic>
                   <pic:nvPicPr>
-                    <pic:cNvPr id="0" name="media_1789148647788.png"/>
+                    <pic:cNvPr id="0" name="oracle_rollup_analytics.png"/>
                     <pic:cNvPicPr/>
                   </pic:nvPicPr>
                   <pic:blipFill>
-                    <a:blip r:embed="rId12"/>
+                    <a:blip r:embed="rId13"/>
                     <a:stretch>
                       <a:fillRect/>
                     </a:stretch>
@@ -7698,7 +7753,7 @@
                   <pic:spPr>
                     <a:xfrm>
                       <a:off x="0" y="0"/>
-                      <a:ext cx="5303520" cy="2983230"/>
+                      <a:ext cx="5303520" cy="4622282"/>
                     </a:xfrm>
                     <a:prstGeom prst="rect"/>
                   </pic:spPr>
@@ -7721,62 +7776,7 @@
           <w:color w:val="64748B"/>
           <w:sz w:val="19"/>
         </w:rPr>
-        <w:t>Figure 3.3: Oracle 11g SQL*Plus Execution — Multi-Table Join &amp; Custody Query Verification</w:t>
-      </w:r>
-    </w:p>
-    <w:p>
-      <w:pPr>
-        <w:spacing w:before="160" w:after="40"/>
-        <w:jc w:val="center"/>
-      </w:pPr>
-      <w:r>
-        <w:drawing>
-          <wp:inline xmlns:a="http://schemas.openxmlformats.org/drawingml/2006/main" xmlns:pic="http://schemas.openxmlformats.org/drawingml/2006/picture">
-            <wp:extent cx="5303520" cy="2983230"/>
-            <wp:docPr id="5" name="Picture 5"/>
-            <wp:cNvGraphicFramePr>
-              <a:graphicFrameLocks noChangeAspect="1"/>
-            </wp:cNvGraphicFramePr>
-            <a:graphic>
-              <a:graphicData uri="http://schemas.openxmlformats.org/drawingml/2006/picture">
-                <pic:pic>
-                  <pic:nvPicPr>
-                    <pic:cNvPr id="0" name="media_1789148654026.png"/>
-                    <pic:cNvPicPr/>
-                  </pic:nvPicPr>
-                  <pic:blipFill>
-                    <a:blip r:embed="rId13"/>
-                    <a:stretch>
-                      <a:fillRect/>
-                    </a:stretch>
-                  </pic:blipFill>
-                  <pic:spPr>
-                    <a:xfrm>
-                      <a:off x="0" y="0"/>
-                      <a:ext cx="5303520" cy="2983230"/>
-                    </a:xfrm>
-                    <a:prstGeom prst="rect"/>
-                  </pic:spPr>
-                </pic:pic>
-              </a:graphicData>
-            </a:graphic>
-          </wp:inline>
-        </w:drawing>
-      </w:r>
-    </w:p>
-    <w:p>
-      <w:pPr>
-        <w:spacing w:after="200"/>
-        <w:jc w:val="center"/>
-      </w:pPr>
-      <w:r>
-        <w:rPr>
-          <w:rFonts w:ascii="Calibri" w:hAnsi="Calibri"/>
-          <w:i/>
-          <w:color w:val="64748B"/>
-          <w:sz w:val="19"/>
-        </w:rPr>
-        <w:t>Figure 3.4: Oracle 11g SQL*Plus Execution — GROUP BY ROLLUP and Aggregate Statistics</w:t>
+        <w:t>Figure 3.4: Oracle 11g SQL*Plus Execution — Hierarchical GROUP BY ROLLUP Analytics</w:t>
       </w:r>
     </w:p>
     <w:p>
@@ -8174,7 +8174,7 @@
       <w:r>
         <w:drawing>
           <wp:inline xmlns:a="http://schemas.openxmlformats.org/drawingml/2006/main" xmlns:pic="http://schemas.openxmlformats.org/drawingml/2006/picture">
-            <wp:extent cx="5303520" cy="2983230"/>
+            <wp:extent cx="5303520" cy="1666498"/>
             <wp:docPr id="6" name="Picture 6"/>
             <wp:cNvGraphicFramePr>
               <a:graphicFrameLocks noChangeAspect="1"/>
@@ -8183,7 +8183,7 @@
               <a:graphicData uri="http://schemas.openxmlformats.org/drawingml/2006/picture">
                 <pic:pic>
                   <pic:nvPicPr>
-                    <pic:cNvPr id="0" name="media_1789148640625.png"/>
+                    <pic:cNvPr id="0" name="oracle_trigger_test.png"/>
                     <pic:cNvPicPr/>
                   </pic:nvPicPr>
                   <pic:blipFill>
@@ -8195,7 +8195,7 @@
                   <pic:spPr>
                     <a:xfrm>
                       <a:off x="0" y="0"/>
-                      <a:ext cx="5303520" cy="2983230"/>
+                      <a:ext cx="5303520" cy="1666498"/>
                     </a:xfrm>
                     <a:prstGeom prst="rect"/>
                   </pic:spPr>
@@ -8218,7 +8218,7 @@
           <w:color w:val="64748B"/>
           <w:sz w:val="19"/>
         </w:rPr>
-        <w:t>Figure 3.5: Oracle 11g SQL*Plus Execution — PL/SQL Triggers and Procedures Compilation &amp; Test Runs</w:t>
+        <w:t>Figure 3.5: Oracle 11g SQL*Plus Execution — Active Trigger TRG_PREVENT_CLOSED_CASE_EVID Spoliation Prevention Test</w:t>
       </w:r>
     </w:p>
     <w:p>
@@ -8254,6 +8254,116 @@
         <w:br/>
         <w:br/>
         <w:t>MongoDB collections mirror and extend relational models through rich Mongoose schemas, indexes, and virtual population references.</w:t>
+      </w:r>
+    </w:p>
+    <w:p>
+      <w:pPr>
+        <w:spacing w:before="160" w:after="40"/>
+        <w:jc w:val="center"/>
+      </w:pPr>
+      <w:r>
+        <w:drawing>
+          <wp:inline xmlns:a="http://schemas.openxmlformats.org/drawingml/2006/main" xmlns:pic="http://schemas.openxmlformats.org/drawingml/2006/picture">
+            <wp:extent cx="5303520" cy="2537817"/>
+            <wp:docPr id="7" name="Picture 7"/>
+            <wp:cNvGraphicFramePr>
+              <a:graphicFrameLocks noChangeAspect="1"/>
+            </wp:cNvGraphicFramePr>
+            <a:graphic>
+              <a:graphicData uri="http://schemas.openxmlformats.org/drawingml/2006/picture">
+                <pic:pic>
+                  <pic:nvPicPr>
+                    <pic:cNvPr id="0" name="nosql_demo_terminal_1.png"/>
+                    <pic:cNvPicPr/>
+                  </pic:nvPicPr>
+                  <pic:blipFill>
+                    <a:blip r:embed="rId15"/>
+                    <a:stretch>
+                      <a:fillRect/>
+                    </a:stretch>
+                  </pic:blipFill>
+                  <pic:spPr>
+                    <a:xfrm>
+                      <a:off x="0" y="0"/>
+                      <a:ext cx="5303520" cy="2537817"/>
+                    </a:xfrm>
+                    <a:prstGeom prst="rect"/>
+                  </pic:spPr>
+                </pic:pic>
+              </a:graphicData>
+            </a:graphic>
+          </wp:inline>
+        </w:drawing>
+      </w:r>
+    </w:p>
+    <w:p>
+      <w:pPr>
+        <w:spacing w:after="200"/>
+        <w:jc w:val="center"/>
+      </w:pPr>
+      <w:r>
+        <w:rPr>
+          <w:rFonts w:ascii="Calibri" w:hAnsi="Calibri"/>
+          <w:i/>
+          <w:color w:val="64748B"/>
+          <w:sz w:val="19"/>
+        </w:rPr>
+        <w:t>Figure 3.6: NoSQL Execution Trace — Live Cloud Handshake, Active Collections &amp; Embedded BSON Subdocument</w:t>
+      </w:r>
+    </w:p>
+    <w:p>
+      <w:pPr>
+        <w:spacing w:before="160" w:after="40"/>
+        <w:jc w:val="center"/>
+      </w:pPr>
+      <w:r>
+        <w:drawing>
+          <wp:inline xmlns:a="http://schemas.openxmlformats.org/drawingml/2006/main" xmlns:pic="http://schemas.openxmlformats.org/drawingml/2006/picture">
+            <wp:extent cx="5303520" cy="2527459"/>
+            <wp:docPr id="8" name="Picture 8"/>
+            <wp:cNvGraphicFramePr>
+              <a:graphicFrameLocks noChangeAspect="1"/>
+            </wp:cNvGraphicFramePr>
+            <a:graphic>
+              <a:graphicData uri="http://schemas.openxmlformats.org/drawingml/2006/picture">
+                <pic:pic>
+                  <pic:nvPicPr>
+                    <pic:cNvPr id="0" name="nosql_demo_terminal_2.png"/>
+                    <pic:cNvPicPr/>
+                  </pic:nvPicPr>
+                  <pic:blipFill>
+                    <a:blip r:embed="rId16"/>
+                    <a:stretch>
+                      <a:fillRect/>
+                    </a:stretch>
+                  </pic:blipFill>
+                  <pic:spPr>
+                    <a:xfrm>
+                      <a:off x="0" y="0"/>
+                      <a:ext cx="5303520" cy="2527459"/>
+                    </a:xfrm>
+                    <a:prstGeom prst="rect"/>
+                  </pic:spPr>
+                </pic:pic>
+              </a:graphicData>
+            </a:graphic>
+          </wp:inline>
+        </w:drawing>
+      </w:r>
+    </w:p>
+    <w:p>
+      <w:pPr>
+        <w:spacing w:after="200"/>
+        <w:jc w:val="center"/>
+      </w:pPr>
+      <w:r>
+        <w:rPr>
+          <w:rFonts w:ascii="Calibri" w:hAnsi="Calibri"/>
+          <w:i/>
+          <w:color w:val="64748B"/>
+          <w:sz w:val="19"/>
+        </w:rPr>
+        <w:t>Figure 3.7: MongoDB Aggregation Pipeline Execution ($lookup + $group + $project) &amp; Duplicate Alert Document</w:t>
       </w:r>
     </w:p>
     <w:p>
@@ -9719,6 +9829,61 @@
     </w:tbl>
     <w:p>
       <w:pPr>
+        <w:spacing w:before="160" w:after="40"/>
+        <w:jc w:val="center"/>
+      </w:pPr>
+      <w:r>
+        <w:drawing>
+          <wp:inline xmlns:a="http://schemas.openxmlformats.org/drawingml/2006/main" xmlns:pic="http://schemas.openxmlformats.org/drawingml/2006/picture">
+            <wp:extent cx="5303520" cy="2542996"/>
+            <wp:docPr id="9" name="Picture 9"/>
+            <wp:cNvGraphicFramePr>
+              <a:graphicFrameLocks noChangeAspect="1"/>
+            </wp:cNvGraphicFramePr>
+            <a:graphic>
+              <a:graphicData uri="http://schemas.openxmlformats.org/drawingml/2006/picture">
+                <pic:pic>
+                  <pic:nvPicPr>
+                    <pic:cNvPr id="0" name="ui_login.png"/>
+                    <pic:cNvPicPr/>
+                  </pic:nvPicPr>
+                  <pic:blipFill>
+                    <a:blip r:embed="rId17"/>
+                    <a:stretch>
+                      <a:fillRect/>
+                    </a:stretch>
+                  </pic:blipFill>
+                  <pic:spPr>
+                    <a:xfrm>
+                      <a:off x="0" y="0"/>
+                      <a:ext cx="5303520" cy="2542996"/>
+                    </a:xfrm>
+                    <a:prstGeom prst="rect"/>
+                  </pic:spPr>
+                </pic:pic>
+              </a:graphicData>
+            </a:graphic>
+          </wp:inline>
+        </w:drawing>
+      </w:r>
+    </w:p>
+    <w:p>
+      <w:pPr>
+        <w:spacing w:after="200"/>
+        <w:jc w:val="center"/>
+      </w:pPr>
+      <w:r>
+        <w:rPr>
+          <w:rFonts w:ascii="Calibri" w:hAnsi="Calibri"/>
+          <w:i/>
+          <w:color w:val="64748B"/>
+          <w:sz w:val="19"/>
+        </w:rPr>
+        <w:t>Figure 4.1: FORENSYS Authentication Portal with Role-Based Persona Sign-In</w:t>
+      </w:r>
+    </w:p>
+    <w:p>
+      <w:pPr>
         <w:keepNext/>
         <w:spacing w:before="280" w:after="80"/>
       </w:pPr>
@@ -9729,7 +9894,7 @@
           <w:color w:val="1E3A8A"/>
           <w:sz w:val="26"/>
         </w:rPr>
-        <w:t>4.3 Digital Artifact SHA-256 Hashing &amp; Duplicate Ingestion Traps</w:t>
+        <w:t>4.3 Crime Report Registration &amp; Case Management</w:t>
       </w:r>
     </w:p>
     <w:p>
@@ -9744,7 +9909,117 @@
           <w:color w:val="212529"/>
           <w:sz w:val="22"/>
         </w:rPr>
-        <w:t>When an investigator registers digital evidence, the backend validates that size_mb is strictly positive and that the file_hash_sha256 matches the 64-character hexadecimal regex ^[a-fA-F0-9]{64}$. Upon insertion, the system executes an automated duplicate detection routine: if the same file hash is detected in another active case, the system flags a DuplicateEvidenceAlert, preventing evidence duplication while alerting detectives to cross-case correlations.</w:t>
+        <w:t>Investigating officers can register new crime reports with title, incident date/time, and geospatial coordinate points. The lead officer is automatically assigned to the logged-in officer per business rules, or can be reassigned to other authorized detectives. Once created, cases are listed on the main dashboard with filterable investigation statuses:</w:t>
+      </w:r>
+    </w:p>
+    <w:p>
+      <w:pPr>
+        <w:spacing w:before="160" w:after="40"/>
+        <w:jc w:val="center"/>
+      </w:pPr>
+      <w:r>
+        <w:drawing>
+          <wp:inline xmlns:a="http://schemas.openxmlformats.org/drawingml/2006/main" xmlns:pic="http://schemas.openxmlformats.org/drawingml/2006/picture">
+            <wp:extent cx="5303520" cy="2050971"/>
+            <wp:docPr id="10" name="Picture 10"/>
+            <wp:cNvGraphicFramePr>
+              <a:graphicFrameLocks noChangeAspect="1"/>
+            </wp:cNvGraphicFramePr>
+            <a:graphic>
+              <a:graphicData uri="http://schemas.openxmlformats.org/drawingml/2006/picture">
+                <pic:pic>
+                  <pic:nvPicPr>
+                    <pic:cNvPr id="0" name="ui_create_case.png"/>
+                    <pic:cNvPicPr/>
+                  </pic:nvPicPr>
+                  <pic:blipFill>
+                    <a:blip r:embed="rId18"/>
+                    <a:stretch>
+                      <a:fillRect/>
+                    </a:stretch>
+                  </pic:blipFill>
+                  <pic:spPr>
+                    <a:xfrm>
+                      <a:off x="0" y="0"/>
+                      <a:ext cx="5303520" cy="2050971"/>
+                    </a:xfrm>
+                    <a:prstGeom prst="rect"/>
+                  </pic:spPr>
+                </pic:pic>
+              </a:graphicData>
+            </a:graphic>
+          </wp:inline>
+        </w:drawing>
+      </w:r>
+    </w:p>
+    <w:p>
+      <w:pPr>
+        <w:spacing w:after="200"/>
+        <w:jc w:val="center"/>
+      </w:pPr>
+      <w:r>
+        <w:rPr>
+          <w:rFonts w:ascii="Calibri" w:hAnsi="Calibri"/>
+          <w:i/>
+          <w:color w:val="64748B"/>
+          <w:sz w:val="19"/>
+        </w:rPr>
+        <w:t>Figure 4.2: Create Crime Report Interface with Automated Lead Officer Assignment</w:t>
+      </w:r>
+    </w:p>
+    <w:p>
+      <w:pPr>
+        <w:spacing w:before="160" w:after="40"/>
+        <w:jc w:val="center"/>
+      </w:pPr>
+      <w:r>
+        <w:drawing>
+          <wp:inline xmlns:a="http://schemas.openxmlformats.org/drawingml/2006/main" xmlns:pic="http://schemas.openxmlformats.org/drawingml/2006/picture">
+            <wp:extent cx="5303520" cy="2522280"/>
+            <wp:docPr id="11" name="Picture 11"/>
+            <wp:cNvGraphicFramePr>
+              <a:graphicFrameLocks noChangeAspect="1"/>
+            </wp:cNvGraphicFramePr>
+            <a:graphic>
+              <a:graphicData uri="http://schemas.openxmlformats.org/drawingml/2006/picture">
+                <pic:pic>
+                  <pic:nvPicPr>
+                    <pic:cNvPr id="0" name="ui_cases_dashboard.png"/>
+                    <pic:cNvPicPr/>
+                  </pic:nvPicPr>
+                  <pic:blipFill>
+                    <a:blip r:embed="rId19"/>
+                    <a:stretch>
+                      <a:fillRect/>
+                    </a:stretch>
+                  </pic:blipFill>
+                  <pic:spPr>
+                    <a:xfrm>
+                      <a:off x="0" y="0"/>
+                      <a:ext cx="5303520" cy="2522280"/>
+                    </a:xfrm>
+                    <a:prstGeom prst="rect"/>
+                  </pic:spPr>
+                </pic:pic>
+              </a:graphicData>
+            </a:graphic>
+          </wp:inline>
+        </w:drawing>
+      </w:r>
+    </w:p>
+    <w:p>
+      <w:pPr>
+        <w:spacing w:after="200"/>
+        <w:jc w:val="center"/>
+      </w:pPr>
+      <w:r>
+        <w:rPr>
+          <w:rFonts w:ascii="Calibri" w:hAnsi="Calibri"/>
+          <w:i/>
+          <w:color w:val="64748B"/>
+          <w:sz w:val="19"/>
+        </w:rPr>
+        <w:t>Figure 4.3: Cases Management Console with Investigation Status Badges &amp; Quick Action Controls</w:t>
       </w:r>
     </w:p>
     <w:p>
@@ -9759,7 +10034,7 @@
           <w:color w:val="1E3A8A"/>
           <w:sz w:val="26"/>
         </w:rPr>
-        <w:t>4.4 Multi-Vector Case Similarity &amp; Graph Network Visualization</w:t>
+        <w:t>4.4 Digital Artifact SHA-256 Hashing &amp; Custodial Chain of Custody</w:t>
       </w:r>
     </w:p>
     <w:p>
@@ -9774,7 +10049,147 @@
           <w:color w:val="212529"/>
           <w:sz w:val="22"/>
         </w:rPr>
-        <w:t>The intelligence engine exposes GET /api/cases/correlation-graph to project all active investigations onto an interactive topological network graph. Nodes represent cases (colored by status and sized by evidence count), and weighted edges represent multi-vector similarity scores above the threshold. Detectives can immediately identify crime rings operating across municipal borders.</w:t>
+        <w:t>When an investigator registers digital evidence, the backend validates that size_mb is strictly positive and that the file_hash_sha256 matches the 64-character hexadecimal regex. During custodial handoffs, the system dynamically checks the most recent CUSTODY_LOG entry to verify that the releasing officer is indeed the current holder, rejecting unauthorized transfers with clear validation alerts:</w:t>
+      </w:r>
+    </w:p>
+    <w:p>
+      <w:pPr>
+        <w:spacing w:before="160" w:after="40"/>
+        <w:jc w:val="center"/>
+      </w:pPr>
+      <w:r>
+        <w:drawing>
+          <wp:inline xmlns:a="http://schemas.openxmlformats.org/drawingml/2006/main" xmlns:pic="http://schemas.openxmlformats.org/drawingml/2006/picture">
+            <wp:extent cx="5303520" cy="2434233"/>
+            <wp:docPr id="12" name="Picture 12"/>
+            <wp:cNvGraphicFramePr>
+              <a:graphicFrameLocks noChangeAspect="1"/>
+            </wp:cNvGraphicFramePr>
+            <a:graphic>
+              <a:graphicData uri="http://schemas.openxmlformats.org/drawingml/2006/picture">
+                <pic:pic>
+                  <pic:nvPicPr>
+                    <pic:cNvPr id="0" name="ui_chain_of_custody.png"/>
+                    <pic:cNvPicPr/>
+                  </pic:nvPicPr>
+                  <pic:blipFill>
+                    <a:blip r:embed="rId20"/>
+                    <a:stretch>
+                      <a:fillRect/>
+                    </a:stretch>
+                  </pic:blipFill>
+                  <pic:spPr>
+                    <a:xfrm>
+                      <a:off x="0" y="0"/>
+                      <a:ext cx="5303520" cy="2434233"/>
+                    </a:xfrm>
+                    <a:prstGeom prst="rect"/>
+                  </pic:spPr>
+                </pic:pic>
+              </a:graphicData>
+            </a:graphic>
+          </wp:inline>
+        </w:drawing>
+      </w:r>
+    </w:p>
+    <w:p>
+      <w:pPr>
+        <w:spacing w:after="200"/>
+        <w:jc w:val="center"/>
+      </w:pPr>
+      <w:r>
+        <w:rPr>
+          <w:rFonts w:ascii="Calibri" w:hAnsi="Calibri"/>
+          <w:i/>
+          <w:color w:val="64748B"/>
+          <w:sz w:val="19"/>
+        </w:rPr>
+        <w:t>Figure 4.4: Log Chain of Custody Interface with Active Custodial Holder Validation &amp; Transfer History</w:t>
+      </w:r>
+    </w:p>
+    <w:p>
+      <w:pPr>
+        <w:keepNext/>
+        <w:spacing w:before="280" w:after="80"/>
+      </w:pPr>
+      <w:r>
+        <w:rPr>
+          <w:rFonts w:ascii="Calibri" w:hAnsi="Calibri"/>
+          <w:b/>
+          <w:color w:val="1E3A8A"/>
+          <w:sz w:val="26"/>
+        </w:rPr>
+        <w:t>4.5 Multi-Vector Case Similarity &amp; Graph Network Visualization</w:t>
+      </w:r>
+    </w:p>
+    <w:p>
+      <w:pPr>
+        <w:spacing w:after="120" w:line="276" w:lineRule="auto"/>
+      </w:pPr>
+      <w:r>
+        <w:rPr>
+          <w:rFonts w:ascii="Calibri" w:hAnsi="Calibri"/>
+          <w:b w:val="0"/>
+          <w:i w:val="0"/>
+          <w:color w:val="212529"/>
+          <w:sz w:val="22"/>
+        </w:rPr>
+        <w:t>The intelligence engine exposes GET /api/cases/correlation-graph to project all active investigations onto an interactive topological network graph. Nodes represent cases (colored by status and sized by evidence count), and weighted edges represent multi-vector similarity scores above the threshold. Detectives can immediately identify crime rings operating across municipal borders:</w:t>
+      </w:r>
+    </w:p>
+    <w:p>
+      <w:pPr>
+        <w:spacing w:before="160" w:after="40"/>
+        <w:jc w:val="center"/>
+      </w:pPr>
+      <w:r>
+        <w:drawing>
+          <wp:inline xmlns:a="http://schemas.openxmlformats.org/drawingml/2006/main" xmlns:pic="http://schemas.openxmlformats.org/drawingml/2006/picture">
+            <wp:extent cx="5303520" cy="2413516"/>
+            <wp:docPr id="13" name="Picture 13"/>
+            <wp:cNvGraphicFramePr>
+              <a:graphicFrameLocks noChangeAspect="1"/>
+            </wp:cNvGraphicFramePr>
+            <a:graphic>
+              <a:graphicData uri="http://schemas.openxmlformats.org/drawingml/2006/picture">
+                <pic:pic>
+                  <pic:nvPicPr>
+                    <pic:cNvPr id="0" name="ui_intelligence_graph.png"/>
+                    <pic:cNvPicPr/>
+                  </pic:nvPicPr>
+                  <pic:blipFill>
+                    <a:blip r:embed="rId21"/>
+                    <a:stretch>
+                      <a:fillRect/>
+                    </a:stretch>
+                  </pic:blipFill>
+                  <pic:spPr>
+                    <a:xfrm>
+                      <a:off x="0" y="0"/>
+                      <a:ext cx="5303520" cy="2413516"/>
+                    </a:xfrm>
+                    <a:prstGeom prst="rect"/>
+                  </pic:spPr>
+                </pic:pic>
+              </a:graphicData>
+            </a:graphic>
+          </wp:inline>
+        </w:drawing>
+      </w:r>
+    </w:p>
+    <w:p>
+      <w:pPr>
+        <w:spacing w:after="200"/>
+        <w:jc w:val="center"/>
+      </w:pPr>
+      <w:r>
+        <w:rPr>
+          <w:rFonts w:ascii="Calibri" w:hAnsi="Calibri"/>
+          <w:i/>
+          <w:color w:val="64748B"/>
+          <w:sz w:val="19"/>
+        </w:rPr>
+        <w:t>Figure 4.5: Cross-Case Linkage &amp; Intelligence Graph with Force-Directed Correlation Topology</w:t>
       </w:r>
     </w:p>
     <w:p>
@@ -9865,61 +10280,6 @@
           <w:sz w:val="22"/>
         </w:rPr>
         <w:t>Administrators access high-level aggregate intelligence: total case counts by status, evidence distributions, digital storage consumption by format, officer workload distribution, and the hierarchical GROUP BY ROLLUP summary.</w:t>
-      </w:r>
-    </w:p>
-    <w:p>
-      <w:pPr>
-        <w:spacing w:before="160" w:after="40"/>
-        <w:jc w:val="center"/>
-      </w:pPr>
-      <w:r>
-        <w:drawing>
-          <wp:inline xmlns:a="http://schemas.openxmlformats.org/drawingml/2006/main" xmlns:pic="http://schemas.openxmlformats.org/drawingml/2006/picture">
-            <wp:extent cx="5303520" cy="2983230"/>
-            <wp:docPr id="7" name="Picture 7"/>
-            <wp:cNvGraphicFramePr>
-              <a:graphicFrameLocks noChangeAspect="1"/>
-            </wp:cNvGraphicFramePr>
-            <a:graphic>
-              <a:graphicData uri="http://schemas.openxmlformats.org/drawingml/2006/picture">
-                <pic:pic>
-                  <pic:nvPicPr>
-                    <pic:cNvPr id="0" name="media_1792400285638_c39904d6.jpg"/>
-                    <pic:cNvPicPr/>
-                  </pic:nvPicPr>
-                  <pic:blipFill>
-                    <a:blip r:embed="rId15"/>
-                    <a:stretch>
-                      <a:fillRect/>
-                    </a:stretch>
-                  </pic:blipFill>
-                  <pic:spPr>
-                    <a:xfrm>
-                      <a:off x="0" y="0"/>
-                      <a:ext cx="5303520" cy="2983230"/>
-                    </a:xfrm>
-                    <a:prstGeom prst="rect"/>
-                  </pic:spPr>
-                </pic:pic>
-              </a:graphicData>
-            </a:graphic>
-          </wp:inline>
-        </w:drawing>
-      </w:r>
-    </w:p>
-    <w:p>
-      <w:pPr>
-        <w:spacing w:after="200"/>
-        <w:jc w:val="center"/>
-      </w:pPr>
-      <w:r>
-        <w:rPr>
-          <w:rFonts w:ascii="Calibri" w:hAnsi="Calibri"/>
-          <w:i/>
-          <w:color w:val="64748B"/>
-          <w:sz w:val="19"/>
-        </w:rPr>
-        <w:t>Figure 4.1: FORENSYS Interactive Web Client — Live Dashboard &amp; Evidence Management Console</w:t>
       </w:r>
     </w:p>
     <w:p>

</xml_diff>